<commit_message>
Docs: actualizar guía de Unidad 3 con el error de imagen no encontrada
</commit_message>
<xml_diff>
--- a/unidad3/Guia_Paso_a_Paso_Estudiante_Unidad3.docx
+++ b/unidad3/Guia_Paso_a_Paso_Estudiante_Unidad3.docx
@@ -5518,6 +5518,134 @@
                 <w:szCs w:val="19"/>
               </w:rPr>
               <w:t xml:space="preserve">La API local sigue corriendo en el puerto 8000. Detenela con Ctrl+C en su terminal.</w:t>
+            </w:r>
+          </w:p>
+        </w:tc>
+      </w:tr>
+      <w:tr>
+        <w:tc>
+          <w:tcPr>
+            <w:tcW w:type="dxa" w:w="4300"/>
+            <w:tcBorders>
+              <w:top w:val="single" w:color="8A9AAB" w:sz="4"/>
+              <w:left w:val="single" w:color="8A9AAB" w:sz="4"/>
+              <w:bottom w:val="single" w:color="8A9AAB" w:sz="4"/>
+              <w:right w:val="single" w:color="8A9AAB" w:sz="4"/>
+            </w:tcBorders>
+            <w:tcMar>
+              <w:top w:type="dxa" w:w="60"/>
+              <w:left w:type="dxa" w:w="100"/>
+              <w:bottom w:type="dxa" w:w="60"/>
+              <w:right w:type="dxa" w:w="100"/>
+            </w:tcMar>
+          </w:tcPr>
+          <w:p>
+            <w:pPr>
+              <w:spacing w:after="0"/>
+            </w:pPr>
+            <w:r>
+              <w:rPr>
+                <w:rFonts w:ascii="Consolas" w:cs="Consolas" w:eastAsia="Consolas" w:hAnsi="Consolas"/>
+                <w:sz w:val="17"/>
+                <w:szCs w:val="17"/>
+              </w:rPr>
+              <w:t xml:space="preserve">docker run</w:t>
+            </w:r>
+            <w:r>
+              <w:rPr>
+                <w:sz w:val="19"/>
+                <w:szCs w:val="19"/>
+              </w:rPr>
+              <w:t xml:space="preserve"> falla con “Unable to find image 'modelo-u3:1.0' locally” y “pull access denied”</w:t>
+            </w:r>
+          </w:p>
+        </w:tc>
+        <w:tc>
+          <w:tcPr>
+            <w:tcW w:type="dxa" w:w="5106"/>
+            <w:tcBorders>
+              <w:top w:val="single" w:color="8A9AAB" w:sz="4"/>
+              <w:left w:val="single" w:color="8A9AAB" w:sz="4"/>
+              <w:bottom w:val="single" w:color="8A9AAB" w:sz="4"/>
+              <w:right w:val="single" w:color="8A9AAB" w:sz="4"/>
+            </w:tcBorders>
+            <w:tcMar>
+              <w:top w:type="dxa" w:w="60"/>
+              <w:left w:type="dxa" w:w="100"/>
+              <w:bottom w:type="dxa" w:w="60"/>
+              <w:right w:type="dxa" w:w="100"/>
+            </w:tcMar>
+          </w:tcPr>
+          <w:p>
+            <w:pPr>
+              <w:spacing w:after="0"/>
+            </w:pPr>
+            <w:r>
+              <w:rPr>
+                <w:sz w:val="19"/>
+                <w:szCs w:val="19"/>
+              </w:rPr>
+              <w:t xml:space="preserve">La imagen no se llegó a construir. Repetí </w:t>
+            </w:r>
+            <w:r>
+              <w:rPr>
+                <w:rFonts w:ascii="Consolas" w:cs="Consolas" w:eastAsia="Consolas" w:hAnsi="Consolas"/>
+                <w:sz w:val="17"/>
+                <w:szCs w:val="17"/>
+              </w:rPr>
+              <w:t xml:space="preserve">docker build -t modelo-u3:1.0 .</w:t>
+            </w:r>
+            <w:r>
+              <w:rPr>
+                <w:sz w:val="19"/>
+                <w:szCs w:val="19"/>
+              </w:rPr>
+              <w:t xml:space="preserve"> desde la carpeta </w:t>
+            </w:r>
+            <w:r>
+              <w:rPr>
+                <w:rFonts w:ascii="Consolas" w:cs="Consolas" w:eastAsia="Consolas" w:hAnsi="Consolas"/>
+                <w:sz w:val="17"/>
+                <w:szCs w:val="17"/>
+              </w:rPr>
+              <w:t xml:space="preserve">unidad3/</w:t>
+            </w:r>
+            <w:r>
+              <w:rPr>
+                <w:sz w:val="19"/>
+                <w:szCs w:val="19"/>
+              </w:rPr>
+              <w:t xml:space="preserve"> y esperá a que termine sin </w:t>
+            </w:r>
+            <w:r>
+              <w:rPr>
+                <w:rFonts w:ascii="Consolas" w:cs="Consolas" w:eastAsia="Consolas" w:hAnsi="Consolas"/>
+                <w:sz w:val="17"/>
+                <w:szCs w:val="17"/>
+              </w:rPr>
+              <w:t xml:space="preserve">ERROR</w:t>
+            </w:r>
+            <w:r>
+              <w:rPr>
+                <w:sz w:val="19"/>
+                <w:szCs w:val="19"/>
+              </w:rPr>
+              <w:t xml:space="preserve"> antes de ejecutar </w:t>
+            </w:r>
+            <w:r>
+              <w:rPr>
+                <w:rFonts w:ascii="Consolas" w:cs="Consolas" w:eastAsia="Consolas" w:hAnsi="Consolas"/>
+                <w:sz w:val="17"/>
+                <w:szCs w:val="17"/>
+              </w:rPr>
+              <w:t xml:space="preserve">docker run</w:t>
+            </w:r>
+            <w:r>
+              <w:rPr>
+                <w:sz w:val="19"/>
+                <w:szCs w:val="19"/>
+              </w:rPr>
+              <w:t xml:space="preserve">.</w:t>
             </w:r>
           </w:p>
         </w:tc>

</xml_diff>